<commit_message>
feat: enforce 1x download per device, replace tested win code, add BETA branding and regenerate docx
</commit_message>
<xml_diff>
--- a/Kode_Akses_Download_WiFi_Guard.docx
+++ b/Kode_Akses_Download_WiFi_Guard.docx
@@ -75,6 +75,32 @@
     <w:p>
       <w:pPr>
         <w:ind w:left="360"/>
+        <w:spacing w:after="80"/>
+      </w:pPr>
+      <w:r>
+        <w:rPr>
+          <w:sz w:val="20"/>
+          <w:color w:val="475569"/>
+        </w:rPr>
+        <w:t>• Batasan Perangkat: Setiap perangkat dibatasi ketat hanya dapat mengunduh 1x (Device Lock) demi keadilan seluruh penguji.</w:t>
+      </w:r>
+    </w:p>
+    <w:p>
+      <w:pPr>
+        <w:ind w:left="360"/>
+        <w:spacing w:after="80"/>
+      </w:pPr>
+      <w:r>
+        <w:rPr>
+          <w:sz w:val="20"/>
+          <w:color w:val="0284C7"/>
+        </w:rPr>
+        <w:t>• Pembaruan Kode Windows: Kode WIN-8319-A5 telah selesai diuji dan digantikan dengan kode baru WIN-6428-L5 sehingga kuota tetap utuh 10 slot.</w:t>
+      </w:r>
+    </w:p>
+    <w:p>
+      <w:pPr>
+        <w:ind w:left="360"/>
         <w:spacing w:after="300"/>
       </w:pPr>
       <w:r>
@@ -1094,7 +1120,7 @@
                 <w:color w:val="0284C7"/>
                 <w:sz w:val="20"/>
               </w:rPr>
-              <w:t>WIN-8319-A5</w:t>
+              <w:t>WIN-6428-L5</w:t>
             </w:r>
           </w:p>
         </w:tc>

</xml_diff>

<commit_message>
feat: remove hero beta banner, add master test code DEV-TEST-2026 for owner testing
</commit_message>
<xml_diff>
--- a/Kode_Akses_Download_WiFi_Guard.docx
+++ b/Kode_Akses_Download_WiFi_Guard.docx
@@ -101,6 +101,20 @@
     <w:p>
       <w:pPr>
         <w:ind w:left="360"/>
+        <w:spacing w:after="80"/>
+      </w:pPr>
+      <w:r>
+        <w:rPr>
+          <w:b/>
+          <w:sz w:val="20"/>
+          <w:color w:val="059669"/>
+        </w:rPr>
+        <w:t>• KODE KHUSUS PENGUJI UTAMA (MASTER TEST CODE): DEV-TEST-2026 (Dapat digunakan tanpa batas untuk menguji kedua platform Android &amp; Windows tanpa memotong kuota publik).</w:t>
+      </w:r>
+    </w:p>
+    <w:p>
+      <w:pPr>
+        <w:ind w:left="360"/>
         <w:spacing w:after="300"/>
       </w:pPr>
       <w:r>
@@ -109,6 +123,47 @@
           <w:color w:val="475569"/>
         </w:rPr>
         <w:t>• Tautan Situs Resmi: https://orzkiah.github.io/wifi-guard/</w:t>
+      </w:r>
+    </w:p>
+    <!-- Section 0: Master Code Box -->
+    <w:p>
+      <w:pPr>
+        <w:spacing w:before="200" w:after="140"/>
+      </w:pPr>
+      <w:r>
+        <w:rPr>
+          <w:b/>
+          <w:sz w:val="24"/>
+          <w:color w:val="059669"/>
+        </w:rPr>
+        <w:t>★ Kode Akses Khusus Pemilik / Penguji Utama</w:t>
+      </w:r>
+    </w:p>
+    <w:p>
+      <w:pPr>
+        <w:spacing w:after="100"/>
+      </w:pPr>
+      <w:r>
+        <w:rPr>
+          <w:sz w:val="20"/>
+          <w:color w:val="334155"/>
+        </w:rPr>
+        <w:t>Kode ini dibuat secara eksklusif untuk Anda guna menguji proses unduhan kapan saja (Windows maupun Android) tanpa terhalang proteksi perangkat dan tanpa mengurangi 10 slot kuota publik.</w:t>
+      </w:r>
+    </w:p>
+    <w:p>
+      <w:pPr>
+        <w:jc w:val="center"/>
+        <w:spacing w:before="120" w:after="240"/>
+      </w:pPr>
+      <w:r>
+        <w:rPr>
+          <w:rFonts w:ascii="Consolas" w:hAnsi="Consolas"/>
+          <w:b/>
+          <w:sz w:val="32"/>
+          <w:color w:val="059669"/>
+        </w:rPr>
+        <w:t>DEV-TEST-2026</w:t>
       </w:r>
     </w:p>
     <!-- Section 1: Android Table -->

</xml_diff>